<commit_message>
Fix a small issue within the doc
</commit_message>
<xml_diff>
--- a/ducument-NZM.docx
+++ b/ducument-NZM.docx
@@ -1158,7 +1158,7 @@
         </w:tabs>
         <w:bidi/>
         <w:rPr>
-          <w:rFonts w:ascii="IRANSansX ExtraBold" w:hAnsi="IRANSansX ExtraBold" w:cs="IRANSansX ExtraBold" w:hint="cs"/>
+          <w:rFonts w:ascii="IRANSansX ExtraBold" w:hAnsi="IRANSansX ExtraBold" w:cs="IRANSansX ExtraBold"/>
           <w:color w:val="000000" w:themeColor="text1"/>
           <w:sz w:val="24"/>
           <w:szCs w:val="24"/>
@@ -1267,7 +1267,29 @@
           <w:rtl/>
           <w:lang w:bidi="fa-IR"/>
         </w:rPr>
-        <w:t xml:space="preserve"> معادل آن را تولید و به صورت گرافیکی نمایش دهد. این سامانه می‌تواند به عنوان یک ابزار آموزشی مؤثر و کاربردی برای دانشجویان استفاده قرار گیرد.</w:t>
+        <w:t xml:space="preserve"> معادل آن را تولید و به صورت گرافیکی نمایش دهد. این سامانه می‌تواند به عنوان یک ابزار آموزشی مؤثر و کاربردی برای دانشجویان</w:t>
+      </w:r>
+      <w:r>
+        <w:rPr>
+          <w:rFonts w:ascii="IRANSansX ExtraBold" w:hAnsi="IRANSansX ExtraBold" w:cs="IRANSansX ExtraBold" w:hint="cs"/>
+          <w:color w:val="000000" w:themeColor="text1"/>
+          <w:sz w:val="24"/>
+          <w:szCs w:val="24"/>
+          <w:rtl/>
+          <w:lang w:bidi="fa-IR"/>
+        </w:rPr>
+        <w:t xml:space="preserve"> مورد</w:t>
+      </w:r>
+      <w:r>
+        <w:rPr>
+          <w:rFonts w:ascii="IRANSansX ExtraBold" w:hAnsi="IRANSansX ExtraBold" w:cs="IRANSansX ExtraBold" w:hint="cs"/>
+          <w:color w:val="000000" w:themeColor="text1"/>
+          <w:sz w:val="24"/>
+          <w:szCs w:val="24"/>
+          <w:rtl/>
+          <w:lang w:bidi="fa-IR"/>
+        </w:rPr>
+        <w:t xml:space="preserve"> استفاده قرار گیرد.</w:t>
       </w:r>
     </w:p>
     <w:p>
@@ -1278,7 +1300,7 @@
         </w:tabs>
         <w:bidi/>
         <w:rPr>
-          <w:rFonts w:ascii="IRANSansX ExtraBold" w:hAnsi="IRANSansX ExtraBold" w:cs="IRANSansX ExtraBold" w:hint="cs"/>
+          <w:rFonts w:ascii="IRANSansX ExtraBold" w:hAnsi="IRANSansX ExtraBold" w:cs="IRANSansX ExtraBold"/>
           <w:color w:val="000000" w:themeColor="text1"/>
           <w:sz w:val="24"/>
           <w:szCs w:val="24"/>
@@ -1334,7 +1356,7 @@
               <w:bidi/>
               <w:jc w:val="center"/>
               <w:rPr>
-                <w:rFonts w:ascii="IRANSansX ExtraBold" w:hAnsi="IRANSansX ExtraBold" w:cs="IRANSansX ExtraBold" w:hint="cs"/>
+                <w:rFonts w:ascii="IRANSansX ExtraBold" w:hAnsi="IRANSansX ExtraBold" w:cs="IRANSansX ExtraBold"/>
                 <w:color w:val="FFFFFF"/>
                 <w:rtl/>
                 <w:lang w:bidi="fa-IR"/>
@@ -1366,7 +1388,7 @@
               <w:jc w:val="center"/>
               <w:cnfStyle w:val="100000000000" w:firstRow="1" w:lastRow="0" w:firstColumn="0" w:lastColumn="0" w:oddVBand="0" w:evenVBand="0" w:oddHBand="0" w:evenHBand="0" w:firstRowFirstColumn="0" w:firstRowLastColumn="0" w:lastRowFirstColumn="0" w:lastRowLastColumn="0"/>
               <w:rPr>
-                <w:rFonts w:ascii="IRANSansX ExtraBold" w:hAnsi="IRANSansX ExtraBold" w:cs="IRANSansX ExtraBold" w:hint="cs"/>
+                <w:rFonts w:ascii="IRANSansX ExtraBold" w:hAnsi="IRANSansX ExtraBold" w:cs="IRANSansX ExtraBold"/>
                 <w:color w:val="FFFFFF"/>
                 <w:rtl/>
                 <w:lang w:bidi="fa-IR"/>
@@ -1401,7 +1423,7 @@
               </w:tabs>
               <w:bidi/>
               <w:rPr>
-                <w:rFonts w:ascii="IRANSansX ExtraBold" w:hAnsi="IRANSansX ExtraBold" w:cs="IRANSansX ExtraBold" w:hint="cs"/>
+                <w:rFonts w:ascii="IRANSansX ExtraBold" w:hAnsi="IRANSansX ExtraBold" w:cs="IRANSansX ExtraBold"/>
                 <w:color w:val="000000" w:themeColor="text1"/>
                 <w:sz w:val="20"/>
                 <w:szCs w:val="20"/>
@@ -1444,7 +1466,7 @@
               <w:bidi/>
               <w:cnfStyle w:val="000000100000" w:firstRow="0" w:lastRow="0" w:firstColumn="0" w:lastColumn="0" w:oddVBand="0" w:evenVBand="0" w:oddHBand="1" w:evenHBand="0" w:firstRowFirstColumn="0" w:firstRowLastColumn="0" w:lastRowFirstColumn="0" w:lastRowLastColumn="0"/>
               <w:rPr>
-                <w:rFonts w:ascii="IRANSansX ExtraBold" w:hAnsi="IRANSansX ExtraBold" w:cs="IRANSansX ExtraBold" w:hint="cs"/>
+                <w:rFonts w:ascii="IRANSansX ExtraBold" w:hAnsi="IRANSansX ExtraBold" w:cs="IRANSansX ExtraBold"/>
                 <w:color w:val="000000" w:themeColor="text1"/>
                 <w:sz w:val="20"/>
                 <w:szCs w:val="20"/>
@@ -1479,7 +1501,7 @@
               </w:tabs>
               <w:bidi/>
               <w:rPr>
-                <w:rFonts w:ascii="IRANSansX ExtraBold" w:hAnsi="IRANSansX ExtraBold" w:cs="IRANSansX ExtraBold" w:hint="cs"/>
+                <w:rFonts w:ascii="IRANSansX ExtraBold" w:hAnsi="IRANSansX ExtraBold" w:cs="IRANSansX ExtraBold"/>
                 <w:color w:val="000000" w:themeColor="text1"/>
                 <w:sz w:val="20"/>
                 <w:szCs w:val="20"/>
@@ -1512,7 +1534,7 @@
               <w:bidi/>
               <w:cnfStyle w:val="000000000000" w:firstRow="0" w:lastRow="0" w:firstColumn="0" w:lastColumn="0" w:oddVBand="0" w:evenVBand="0" w:oddHBand="0" w:evenHBand="0" w:firstRowFirstColumn="0" w:firstRowLastColumn="0" w:lastRowFirstColumn="0" w:lastRowLastColumn="0"/>
               <w:rPr>
-                <w:rFonts w:ascii="IRANSansX ExtraBold" w:hAnsi="IRANSansX ExtraBold" w:cs="IRANSansX ExtraBold" w:hint="cs"/>
+                <w:rFonts w:ascii="IRANSansX ExtraBold" w:hAnsi="IRANSansX ExtraBold" w:cs="IRANSansX ExtraBold"/>
                 <w:color w:val="000000" w:themeColor="text1"/>
                 <w:sz w:val="20"/>
                 <w:szCs w:val="20"/>
@@ -1550,7 +1572,7 @@
               </w:tabs>
               <w:bidi/>
               <w:rPr>
-                <w:rFonts w:ascii="IRANSansX ExtraBold" w:hAnsi="IRANSansX ExtraBold" w:cs="IRANSansX ExtraBold" w:hint="cs"/>
+                <w:rFonts w:ascii="IRANSansX ExtraBold" w:hAnsi="IRANSansX ExtraBold" w:cs="IRANSansX ExtraBold"/>
                 <w:color w:val="000000" w:themeColor="text1"/>
                 <w:sz w:val="20"/>
                 <w:szCs w:val="20"/>
@@ -1593,7 +1615,7 @@
               <w:bidi/>
               <w:cnfStyle w:val="000000100000" w:firstRow="0" w:lastRow="0" w:firstColumn="0" w:lastColumn="0" w:oddVBand="0" w:evenVBand="0" w:oddHBand="1" w:evenHBand="0" w:firstRowFirstColumn="0" w:firstRowLastColumn="0" w:lastRowFirstColumn="0" w:lastRowLastColumn="0"/>
               <w:rPr>
-                <w:rFonts w:ascii="IRANSansX ExtraBold" w:hAnsi="IRANSansX ExtraBold" w:cs="IRANSansX ExtraBold" w:hint="cs"/>
+                <w:rFonts w:ascii="IRANSansX ExtraBold" w:hAnsi="IRANSansX ExtraBold" w:cs="IRANSansX ExtraBold"/>
                 <w:color w:val="000000" w:themeColor="text1"/>
                 <w:sz w:val="20"/>
                 <w:szCs w:val="20"/>
@@ -1628,7 +1650,7 @@
               </w:tabs>
               <w:bidi/>
               <w:rPr>
-                <w:rFonts w:ascii="IRANSansX ExtraBold" w:hAnsi="IRANSansX ExtraBold" w:cs="IRANSansX ExtraBold" w:hint="cs"/>
+                <w:rFonts w:ascii="IRANSansX ExtraBold" w:hAnsi="IRANSansX ExtraBold" w:cs="IRANSansX ExtraBold"/>
                 <w:color w:val="000000" w:themeColor="text1"/>
                 <w:sz w:val="20"/>
                 <w:szCs w:val="20"/>
@@ -1671,7 +1693,7 @@
               <w:bidi/>
               <w:cnfStyle w:val="000000000000" w:firstRow="0" w:lastRow="0" w:firstColumn="0" w:lastColumn="0" w:oddVBand="0" w:evenVBand="0" w:oddHBand="0" w:evenHBand="0" w:firstRowFirstColumn="0" w:firstRowLastColumn="0" w:lastRowFirstColumn="0" w:lastRowLastColumn="0"/>
               <w:rPr>
-                <w:rFonts w:ascii="IRANSansX ExtraBold" w:hAnsi="IRANSansX ExtraBold" w:cs="IRANSansX ExtraBold" w:hint="cs"/>
+                <w:rFonts w:ascii="IRANSansX ExtraBold" w:hAnsi="IRANSansX ExtraBold" w:cs="IRANSansX ExtraBold"/>
                 <w:color w:val="000000" w:themeColor="text1"/>
                 <w:sz w:val="20"/>
                 <w:szCs w:val="20"/>
@@ -1729,7 +1751,7 @@
               </w:tabs>
               <w:bidi/>
               <w:rPr>
-                <w:rFonts w:ascii="IRANSansX ExtraBold" w:hAnsi="IRANSansX ExtraBold" w:cs="IRANSansX ExtraBold" w:hint="cs"/>
+                <w:rFonts w:ascii="IRANSansX ExtraBold" w:hAnsi="IRANSansX ExtraBold" w:cs="IRANSansX ExtraBold"/>
                 <w:color w:val="000000" w:themeColor="text1"/>
                 <w:sz w:val="20"/>
                 <w:szCs w:val="20"/>
@@ -1830,7 +1852,7 @@
               <w:bidi/>
               <w:cnfStyle w:val="000000100000" w:firstRow="0" w:lastRow="0" w:firstColumn="0" w:lastColumn="0" w:oddVBand="0" w:evenVBand="0" w:oddHBand="1" w:evenHBand="0" w:firstRowFirstColumn="0" w:firstRowLastColumn="0" w:lastRowFirstColumn="0" w:lastRowLastColumn="0"/>
               <w:rPr>
-                <w:rFonts w:ascii="IRANSansX ExtraBold" w:hAnsi="IRANSansX ExtraBold" w:cs="IRANSansX ExtraBold" w:hint="cs"/>
+                <w:rFonts w:ascii="IRANSansX ExtraBold" w:hAnsi="IRANSansX ExtraBold" w:cs="IRANSansX ExtraBold"/>
                 <w:color w:val="000000" w:themeColor="text1"/>
                 <w:sz w:val="20"/>
                 <w:szCs w:val="20"/>
@@ -1961,7 +1983,7 @@
         </w:tabs>
         <w:bidi/>
         <w:rPr>
-          <w:rFonts w:ascii="IRANSansX ExtraBold" w:hAnsi="IRANSansX ExtraBold" w:cs="IRANSansX ExtraBold" w:hint="cs"/>
+          <w:rFonts w:ascii="IRANSansX ExtraBold" w:hAnsi="IRANSansX ExtraBold" w:cs="IRANSansX ExtraBold"/>
           <w:color w:val="000000" w:themeColor="text1"/>
           <w:sz w:val="24"/>
           <w:szCs w:val="24"/>
@@ -2013,7 +2035,7 @@
         </w:tabs>
         <w:bidi/>
         <w:rPr>
-          <w:rFonts w:ascii="IRANSansX ExtraBold" w:hAnsi="IRANSansX ExtraBold" w:cs="IRANSansX ExtraBold" w:hint="cs"/>
+          <w:rFonts w:ascii="IRANSansX ExtraBold" w:hAnsi="IRANSansX ExtraBold" w:cs="IRANSansX ExtraBold"/>
           <w:color w:val="000000" w:themeColor="text1"/>
           <w:sz w:val="24"/>
           <w:szCs w:val="24"/>
@@ -2702,7 +2724,6 @@
           <w:color w:val="4472C4" w:themeColor="accent1"/>
           <w:sz w:val="32"/>
           <w:szCs w:val="32"/>
-          <w:rtl/>
           <w:lang w:bidi="fa-IR"/>
         </w:rPr>
       </w:pPr>
@@ -2737,7 +2758,7 @@
         </w:tabs>
         <w:bidi/>
         <w:rPr>
-          <w:rFonts w:ascii="IRANSansX ExtraBold" w:hAnsi="IRANSansX ExtraBold" w:cs="IRANSansX ExtraBold"/>
+          <w:rFonts w:ascii="IRANSansX ExtraBold" w:hAnsi="IRANSansX ExtraBold" w:cs="IRANSansX ExtraBold" w:hint="cs"/>
           <w:color w:val="000000" w:themeColor="text1"/>
           <w:sz w:val="24"/>
           <w:szCs w:val="24"/>
@@ -2923,7 +2944,7 @@
         </w:tabs>
         <w:bidi/>
         <w:rPr>
-          <w:rFonts w:ascii="IRANSansX ExtraBold" w:hAnsi="IRANSansX ExtraBold" w:cs="IRANSansX ExtraBold" w:hint="cs"/>
+          <w:rFonts w:ascii="IRANSansX ExtraBold" w:hAnsi="IRANSansX ExtraBold" w:cs="IRANSansX ExtraBold"/>
           <w:color w:val="000000" w:themeColor="text1"/>
           <w:sz w:val="24"/>
           <w:szCs w:val="24"/>
@@ -4420,6 +4441,7 @@
   <w:style w:type="character" w:default="1" w:styleId="DefaultParagraphFont">
     <w:name w:val="Default Paragraph Font"/>
     <w:uiPriority w:val="1"/>
+    <w:semiHidden/>
     <w:unhideWhenUsed/>
   </w:style>
   <w:style w:type="table" w:default="1" w:styleId="TableNormal">

</xml_diff>